<commit_message>
Remove inferred student identity from report
</commit_message>
<xml_diff>
--- a/report/Google_Local_Analysis_Report.docx
+++ b/report/Google_Local_Analysis_Report.docx
@@ -27,7 +27,7 @@
     </w:p>
     <w:p>
       <w:r>
-        <w:t>Name: Kondwani Phiri</w:t>
+        <w:t>Name: [Enter student name]</w:t>
         <w:br/>
         <w:t>NCC Education student number: [Enter NCC student number]</w:t>
         <w:br/>
@@ -817,7 +817,7 @@
       <w:rPr>
         <w:sz w:val="18"/>
       </w:rPr>
-      <w:t>Kondwani Phiri | NCC [Enter NCC student number]</w:t>
+      <w:t>[Enter student name] | NCC [Enter NCC student number]</w:t>
       <w:br/>
       <w:t>Word count 3,905</w:t>
     </w:r>

</xml_diff>